<commit_message>
CV: updated StudyNest entry (Nour, WebRTC, 22 models, 394 tests, refresh-token rotation)
</commit_message>
<xml_diff>
--- a/public/resume/Rashid_Al_Ghafri_CV_ATS.docx
+++ b/public/resume/Rashid_Al_Ghafri_CV_ATS.docx
@@ -389,7 +389,7 @@
           <w:sz w:val="20"/>
           <w:szCs w:val="20"/>
         </w:rPr>
-        <w:t xml:space="preserve">StudyNest — AI-Based Collaborative Study Platform</w:t>
+        <w:t xml:space="preserve">StudyNest — Collaborative Study Platform with an AI Study Buddy</w:t>
       </w:r>
       <w:r>
         <w:rPr>
@@ -410,7 +410,7 @@
           <w:sz w:val="17"/>
           <w:szCs w:val="17"/>
         </w:rPr>
-        <w:t xml:space="preserve">Senior Capstone · graded Distinction · studynest.dev · React · Node.js · MongoDB · Socket.IO · Gemini API</w:t>
+        <w:t xml:space="preserve">Senior Capstone · graded Distinction · studynest.dev · Next.js · TypeScript · Node.js · MongoDB · WebRTC · Gemini API</w:t>
       </w:r>
     </w:p>
     <w:p>
@@ -446,7 +446,7 @@
           <w:sz w:val="17"/>
           <w:szCs w:val="17"/>
         </w:rPr>
-        <w:t xml:space="preserve">Real-time study rooms over Socket.IO — live chat, voice, video, screen sharing, and role-based controls.</w:t>
+        <w:t xml:space="preserve">WebRTC study rooms with Socket.IO signalling — live chat, voice, video, screen sharing, and role-based controls.</w:t>
       </w:r>
     </w:p>
     <w:p>
@@ -464,7 +464,7 @@
           <w:sz w:val="17"/>
           <w:szCs w:val="17"/>
         </w:rPr>
-        <w:t xml:space="preserve">Google Gemini–powered study assistant that analyses documents and images, answers questions, and generates study plans and flashcards.</w:t>
+        <w:t xml:space="preserve">Nour, a Gemini-powered study buddy that analyses documents and images, answers questions, and makes study plans, quizzes and flashcards on request.</w:t>
       </w:r>
     </w:p>
     <w:p>
@@ -482,7 +482,7 @@
           <w:sz w:val="17"/>
           <w:szCs w:val="17"/>
         </w:rPr>
-        <w:t xml:space="preserve">100+ REST endpoints, 20 data models, JWT with refresh-token rotation and 2FA; 139 passing tests (125 integration, 14 unit). 44-student pilot: 86% high satisfaction, 95% said the AI assistant improved how they study.</w:t>
+        <w:t xml:space="preserve">100+ REST endpoints, 22 data models, JWT with refresh-token rotation and 2FA; 394 passing tests (317 server, 77 frontend). 44-student pilot: 86% high satisfaction, 95% said the AI assistant improved how they study.</w:t>
       </w:r>
     </w:p>
     <w:p>

</xml_diff>